<commit_message>
Refactor: Rewrite C2 Report since the implement of the batch changing from binary search into BST
</commit_message>
<xml_diff>
--- a/Ontrack_Files/C2/C2 Report.docx
+++ b/Ontrack_Files/C2/C2 Report.docx
@@ -115,33 +115,51 @@
           <w:szCs w:val="23"/>
           <w14:ligatures w14:val="none"/>
         </w:rPr>
-        <w:t>I store the batches in a generic linked list because the number of batches is now known in advance. Each Batch owns a dynamically allocated array of Post objects.</w:t>
-      </w:r>
-    </w:p>
-    <w:p>
-      <w:pPr>
-        <w:shd w:val="clear" w:color="auto" w:fill="FFFFFF"/>
-        <w:spacing w:after="0" w:line="240" w:lineRule="auto"/>
-        <w:outlineLvl w:val="1"/>
-        <w:rPr>
-          <w:rFonts w:ascii="Open Sans" w:eastAsia="Times New Roman" w:hAnsi="Open Sans" w:cs="Open Sans"/>
-          <w:color w:val="222222"/>
-          <w:kern w:val="0"/>
-          <w:sz w:val="23"/>
-          <w:szCs w:val="23"/>
-          <w14:ligatures w14:val="none"/>
-        </w:rPr>
-      </w:pPr>
-      <w:r>
-        <w:rPr>
-          <w:rFonts w:ascii="Open Sans" w:eastAsia="Times New Roman" w:hAnsi="Open Sans" w:cs="Open Sans"/>
-          <w:color w:val="222222"/>
-          <w:kern w:val="0"/>
-          <w:sz w:val="23"/>
-          <w:szCs w:val="23"/>
-          <w14:ligatures w14:val="none"/>
-        </w:rPr>
-        <w:t>A deep copy is made when a batch is stored so that the analyser doesn’t depend on the input array after the input array is deleted.</w:t>
+        <w:t xml:space="preserve">I store the batches in a generic linked list because the number of batches is now </w:t>
+      </w:r>
+      <w:r>
+        <w:rPr>
+          <w:rFonts w:ascii="Open Sans" w:eastAsia="Times New Roman" w:hAnsi="Open Sans" w:cs="Open Sans" w:hint="eastAsia"/>
+          <w:color w:val="222222"/>
+          <w:kern w:val="0"/>
+          <w:sz w:val="23"/>
+          <w:szCs w:val="23"/>
+          <w14:ligatures w14:val="none"/>
+        </w:rPr>
+        <w:t>not</w:t>
+      </w:r>
+      <w:r>
+        <w:rPr>
+          <w:rFonts w:ascii="Open Sans" w:eastAsia="Times New Roman" w:hAnsi="Open Sans" w:cs="Open Sans"/>
+          <w:color w:val="222222"/>
+          <w:kern w:val="0"/>
+          <w:sz w:val="23"/>
+          <w:szCs w:val="23"/>
+          <w14:ligatures w14:val="none"/>
+        </w:rPr>
+        <w:t xml:space="preserve"> </w:t>
+      </w:r>
+      <w:r>
+        <w:rPr>
+          <w:rFonts w:ascii="Open Sans" w:eastAsia="Times New Roman" w:hAnsi="Open Sans" w:cs="Open Sans"/>
+          <w:color w:val="222222"/>
+          <w:kern w:val="0"/>
+          <w:sz w:val="23"/>
+          <w:szCs w:val="23"/>
+          <w14:ligatures w14:val="none"/>
+        </w:rPr>
+        <w:t xml:space="preserve">known in advance. </w:t>
+      </w:r>
+      <w:r>
+        <w:rPr>
+          <w:rFonts w:ascii="Open Sans" w:eastAsia="Times New Roman" w:hAnsi="Open Sans" w:cs="Open Sans"/>
+          <w:color w:val="222222"/>
+          <w:kern w:val="0"/>
+          <w:sz w:val="23"/>
+          <w:szCs w:val="23"/>
+          <w14:ligatures w14:val="none"/>
+        </w:rPr>
+        <w:t>Each batch stores the posts in binary search tree, ordered by their number of likes.</w:t>
       </w:r>
     </w:p>
     <w:p>
@@ -182,7 +200,97 @@
           <w:szCs w:val="23"/>
           <w14:ligatures w14:val="none"/>
         </w:rPr>
-        <w:t>When a batch is added, generic merge sort is used to sort its post in ascending order of likes. This cost O(</w:t>
+        <w:t xml:space="preserve">When a batch is added, generic merge sort is used to sort its post in ascending order of likes. This cost </w:t>
+      </w:r>
+      <w:proofErr w:type="gramStart"/>
+      <w:r>
+        <w:rPr>
+          <w:rFonts w:ascii="Open Sans" w:eastAsia="Times New Roman" w:hAnsi="Open Sans" w:cs="Open Sans"/>
+          <w:color w:val="222222"/>
+          <w:kern w:val="0"/>
+          <w:sz w:val="23"/>
+          <w:szCs w:val="23"/>
+          <w14:ligatures w14:val="none"/>
+        </w:rPr>
+        <w:t>O(</w:t>
+      </w:r>
+      <w:proofErr w:type="gramEnd"/>
+      <w:r>
+        <w:rPr>
+          <w:rFonts w:ascii="Open Sans" w:eastAsia="Times New Roman" w:hAnsi="Open Sans" w:cs="Open Sans"/>
+          <w:color w:val="222222"/>
+          <w:kern w:val="0"/>
+          <w:sz w:val="23"/>
+          <w:szCs w:val="23"/>
+          <w14:ligatures w14:val="none"/>
+        </w:rPr>
+        <w:t>n</w:t>
+      </w:r>
+      <w:r>
+        <w:rPr>
+          <w:rFonts w:ascii="Open Sans" w:eastAsia="Times New Roman" w:hAnsi="Open Sans" w:cs="Open Sans"/>
+          <w:color w:val="222222"/>
+          <w:kern w:val="0"/>
+          <w:sz w:val="23"/>
+          <w:szCs w:val="23"/>
+          <w14:ligatures w14:val="none"/>
+        </w:rPr>
+        <w:t xml:space="preserve"> </w:t>
+      </w:r>
+      <w:r>
+        <w:rPr>
+          <w:rFonts w:ascii="Open Sans" w:eastAsia="Times New Roman" w:hAnsi="Open Sans" w:cs="Open Sans"/>
+          <w:color w:val="222222"/>
+          <w:kern w:val="0"/>
+          <w:sz w:val="23"/>
+          <w:szCs w:val="23"/>
+          <w14:ligatures w14:val="none"/>
+        </w:rPr>
+        <w:t>log</w:t>
+      </w:r>
+      <w:r>
+        <w:rPr>
+          <w:rFonts w:ascii="Open Sans" w:eastAsia="Times New Roman" w:hAnsi="Open Sans" w:cs="Open Sans"/>
+          <w:color w:val="222222"/>
+          <w:kern w:val="0"/>
+          <w:sz w:val="23"/>
+          <w:szCs w:val="23"/>
+          <w14:ligatures w14:val="none"/>
+        </w:rPr>
+        <w:t xml:space="preserve"> </w:t>
+      </w:r>
+      <w:r>
+        <w:rPr>
+          <w:rFonts w:ascii="Open Sans" w:eastAsia="Times New Roman" w:hAnsi="Open Sans" w:cs="Open Sans"/>
+          <w:color w:val="222222"/>
+          <w:kern w:val="0"/>
+          <w:sz w:val="23"/>
+          <w:szCs w:val="23"/>
+          <w14:ligatures w14:val="none"/>
+        </w:rPr>
+        <w:t xml:space="preserve">n). </w:t>
+      </w:r>
+      <w:r>
+        <w:rPr>
+          <w:rFonts w:ascii="Open Sans" w:eastAsia="Times New Roman" w:hAnsi="Open Sans" w:cs="Open Sans"/>
+          <w:color w:val="222222"/>
+          <w:kern w:val="0"/>
+          <w:sz w:val="23"/>
+          <w:szCs w:val="23"/>
+          <w14:ligatures w14:val="none"/>
+        </w:rPr>
+        <w:t xml:space="preserve">A BST is then constructed recursively </w:t>
+      </w:r>
+      <w:r>
+        <w:rPr>
+          <w:rFonts w:ascii="Open Sans" w:eastAsia="Times New Roman" w:hAnsi="Open Sans" w:cs="Open Sans"/>
+          <w:color w:val="222222"/>
+          <w:kern w:val="0"/>
+          <w:sz w:val="23"/>
+          <w:szCs w:val="23"/>
+          <w14:ligatures w14:val="none"/>
+        </w:rPr>
+        <w:t xml:space="preserve">by repeatedly selecting the middle element of each sorted range, taking O(n). Therefore, </w:t>
       </w:r>
       <w:proofErr w:type="spellStart"/>
       <w:r>
@@ -194,7 +302,7 @@
           <w:szCs w:val="23"/>
           <w14:ligatures w14:val="none"/>
         </w:rPr>
-        <w:t>nlogn</w:t>
+        <w:t>add_batch</w:t>
       </w:r>
       <w:proofErr w:type="spellEnd"/>
       <w:r>
@@ -206,7 +314,31 @@
           <w:szCs w:val="23"/>
           <w14:ligatures w14:val="none"/>
         </w:rPr>
-        <w:t>). The sorted order allows binary search to locate a post by likes and a modified binary search to find the first post hose likes are strictly greater than the threshold.</w:t>
+        <w:t xml:space="preserve"> has an overall worst-case complexity of </w:t>
+      </w:r>
+      <w:proofErr w:type="gramStart"/>
+      <w:r>
+        <w:rPr>
+          <w:rFonts w:ascii="Open Sans" w:eastAsia="Times New Roman" w:hAnsi="Open Sans" w:cs="Open Sans"/>
+          <w:color w:val="222222"/>
+          <w:kern w:val="0"/>
+          <w:sz w:val="23"/>
+          <w:szCs w:val="23"/>
+          <w14:ligatures w14:val="none"/>
+        </w:rPr>
+        <w:t>O(</w:t>
+      </w:r>
+      <w:proofErr w:type="gramEnd"/>
+      <w:r>
+        <w:rPr>
+          <w:rFonts w:ascii="Open Sans" w:eastAsia="Times New Roman" w:hAnsi="Open Sans" w:cs="Open Sans"/>
+          <w:color w:val="222222"/>
+          <w:kern w:val="0"/>
+          <w:sz w:val="23"/>
+          <w:szCs w:val="23"/>
+          <w14:ligatures w14:val="none"/>
+        </w:rPr>
+        <w:t>nlog n).</w:t>
       </w:r>
     </w:p>
     <w:p>
@@ -247,7 +379,42 @@
           <w:szCs w:val="23"/>
           <w14:ligatures w14:val="none"/>
         </w:rPr>
-        <w:t xml:space="preserve">To remove a post, each batch is searched using binary search until the matching unique likes value is found. The batch then creates a smaller array and copies all posts except the removed one. Therefore, the current implementation has worst-case complexity </w:t>
+        <w:t xml:space="preserve">To remove a post, </w:t>
+      </w:r>
+      <w:r>
+        <w:rPr>
+          <w:rFonts w:ascii="Open Sans" w:eastAsia="Times New Roman" w:hAnsi="Open Sans" w:cs="Open Sans"/>
+          <w:color w:val="222222"/>
+          <w:kern w:val="0"/>
+          <w:sz w:val="23"/>
+          <w:szCs w:val="23"/>
+          <w14:ligatures w14:val="none"/>
+        </w:rPr>
+        <w:t xml:space="preserve">each batch BST is searched using </w:t>
+      </w:r>
+      <w:proofErr w:type="spellStart"/>
+      <w:r>
+        <w:rPr>
+          <w:rFonts w:ascii="Open Sans" w:eastAsia="Times New Roman" w:hAnsi="Open Sans" w:cs="Open Sans"/>
+          <w:color w:val="222222"/>
+          <w:kern w:val="0"/>
+          <w:sz w:val="23"/>
+          <w:szCs w:val="23"/>
+          <w14:ligatures w14:val="none"/>
+        </w:rPr>
+        <w:t>its</w:t>
+      </w:r>
+      <w:proofErr w:type="spellEnd"/>
+      <w:r>
+        <w:rPr>
+          <w:rFonts w:ascii="Open Sans" w:eastAsia="Times New Roman" w:hAnsi="Open Sans" w:cs="Open Sans"/>
+          <w:color w:val="222222"/>
+          <w:kern w:val="0"/>
+          <w:sz w:val="23"/>
+          <w:szCs w:val="23"/>
+          <w14:ligatures w14:val="none"/>
+        </w:rPr>
+        <w:t xml:space="preserve"> likes, a search and deletion </w:t>
       </w:r>
       <w:proofErr w:type="gramStart"/>
       <w:r>
@@ -259,7 +426,7 @@
           <w:szCs w:val="23"/>
           <w14:ligatures w14:val="none"/>
         </w:rPr>
-        <w:t>O(</w:t>
+        <w:t>takes</w:t>
       </w:r>
       <w:proofErr w:type="gramEnd"/>
       <w:r>
@@ -271,7 +438,7 @@
           <w:szCs w:val="23"/>
           <w14:ligatures w14:val="none"/>
         </w:rPr>
-        <w:t>b log n + n).</w:t>
+        <w:t xml:space="preserve"> O (log n) when the tree height is logarithmic, so checking up to up to b batches takes O (b log n)</w:t>
       </w:r>
     </w:p>
     <w:p>
@@ -312,7 +479,7 @@
           <w:szCs w:val="23"/>
           <w14:ligatures w14:val="none"/>
         </w:rPr>
-        <w:t xml:space="preserve">For a threshold query, modified binary search finds the smallest post above the threshold in each batch. The smallest of these candidates is returned, giving </w:t>
+        <w:t xml:space="preserve">For a threshold query, each BST is searched along one root-to-leaf path to find its smallest post above the threshold. Comparing the result from all b batches gives </w:t>
       </w:r>
       <w:proofErr w:type="gramStart"/>
       <w:r>
@@ -336,7 +503,29 @@
           <w:szCs w:val="23"/>
           <w14:ligatures w14:val="none"/>
         </w:rPr>
-        <w:t>b log n)</w:t>
+        <w:t>b</w:t>
+      </w:r>
+      <w:r>
+        <w:rPr>
+          <w:rFonts w:ascii="Open Sans" w:eastAsia="Times New Roman" w:hAnsi="Open Sans" w:cs="Open Sans"/>
+          <w:color w:val="222222"/>
+          <w:kern w:val="0"/>
+          <w:sz w:val="23"/>
+          <w:szCs w:val="23"/>
+          <w14:ligatures w14:val="none"/>
+        </w:rPr>
+        <w:t xml:space="preserve"> </w:t>
+      </w:r>
+      <w:r>
+        <w:rPr>
+          <w:rFonts w:ascii="Open Sans" w:eastAsia="Times New Roman" w:hAnsi="Open Sans" w:cs="Open Sans"/>
+          <w:color w:val="222222"/>
+          <w:kern w:val="0"/>
+          <w:sz w:val="23"/>
+          <w:szCs w:val="23"/>
+          <w14:ligatures w14:val="none"/>
+        </w:rPr>
+        <w:t>log n).</w:t>
       </w:r>
     </w:p>
     <w:p>
@@ -403,42 +592,7 @@
           <w:szCs w:val="23"/>
           <w14:ligatures w14:val="none"/>
         </w:rPr>
-        <w:t xml:space="preserve">Each batch is stored in ascending order of likes, so the modified binary search can correctly find the first post whose likes are strictly greater than the given threshold. Because the batch is sorted, this first valid post must also be the least popular post </w:t>
-      </w:r>
-      <w:r>
-        <w:rPr>
-          <w:rFonts w:ascii="Open Sans" w:eastAsia="Times New Roman" w:hAnsi="Open Sans" w:cs="Open Sans"/>
-          <w:color w:val="222222"/>
-          <w:kern w:val="0"/>
-          <w:sz w:val="23"/>
-          <w:szCs w:val="23"/>
-          <w14:ligatures w14:val="none"/>
-        </w:rPr>
-        <w:t>among batches. The algorithm performs this search for every batch. Whenever a valid candidate is found, it compares the candidate’s number of likes with the current result. The result is updated only if the new candidate has fewer likes. Therefore, after all batches have been checked, the result points to the post with the smallest number of likes among all posts whose likes are greater than the threshold. If a batch has no post above the threshold, the modified binary search returns ‘-1’ which indicates there is no candidate in the current batch. If no batch contains a valid post, the result remains ‘</w:t>
-      </w:r>
-      <w:proofErr w:type="spellStart"/>
-      <w:r>
-        <w:rPr>
-          <w:rFonts w:ascii="Open Sans" w:eastAsia="Times New Roman" w:hAnsi="Open Sans" w:cs="Open Sans"/>
-          <w:color w:val="222222"/>
-          <w:kern w:val="0"/>
-          <w:sz w:val="23"/>
-          <w:szCs w:val="23"/>
-          <w14:ligatures w14:val="none"/>
-        </w:rPr>
-        <w:t>nullptr</w:t>
-      </w:r>
-      <w:proofErr w:type="spellEnd"/>
-      <w:r>
-        <w:rPr>
-          <w:rFonts w:ascii="Open Sans" w:eastAsia="Times New Roman" w:hAnsi="Open Sans" w:cs="Open Sans"/>
-          <w:color w:val="222222"/>
-          <w:kern w:val="0"/>
-          <w:sz w:val="23"/>
-          <w:szCs w:val="23"/>
-          <w14:ligatures w14:val="none"/>
-        </w:rPr>
-        <w:t>’.</w:t>
+        <w:t>Each batch is stored as a BST ordered by the number of likes. To find the least popular post above the threshold within one batch, the search starts at the root. If the current post has more likes than the threshold, it is a valid candidate, but a smaller valid post may exist in its left subtree. Therefore, the current post is stored as the result and the search continues left. If the current post has likes less than or equal to the threshold, neither it nor any post in its left subtree can satisfy the condition, so the search continues right.</w:t>
       </w:r>
     </w:p>
     <w:p>
@@ -465,6 +619,191 @@
           <w:rFonts w:ascii="Open Sans" w:eastAsia="Times New Roman" w:hAnsi="Open Sans" w:cs="Open Sans"/>
           <w:color w:val="222222"/>
           <w:kern w:val="0"/>
+          <w:sz w:val="23"/>
+          <w:szCs w:val="23"/>
+          <w14:ligatures w14:val="none"/>
+        </w:rPr>
+      </w:pPr>
+      <w:r>
+        <w:rPr>
+          <w:rFonts w:ascii="Open Sans" w:eastAsia="Times New Roman" w:hAnsi="Open Sans" w:cs="Open Sans"/>
+          <w:color w:val="222222"/>
+          <w:kern w:val="0"/>
+          <w:sz w:val="23"/>
+          <w:szCs w:val="23"/>
+          <w14:ligatures w14:val="none"/>
+        </w:rPr>
+        <w:t xml:space="preserve">When the search reaches </w:t>
+      </w:r>
+      <w:proofErr w:type="spellStart"/>
+      <w:r>
+        <w:rPr>
+          <w:rFonts w:ascii="Open Sans" w:eastAsia="Times New Roman" w:hAnsi="Open Sans" w:cs="Open Sans"/>
+          <w:color w:val="222222"/>
+          <w:kern w:val="0"/>
+          <w:sz w:val="23"/>
+          <w:szCs w:val="23"/>
+          <w14:ligatures w14:val="none"/>
+        </w:rPr>
+        <w:t>nullptr</w:t>
+      </w:r>
+      <w:proofErr w:type="spellEnd"/>
+      <w:r>
+        <w:rPr>
+          <w:rFonts w:ascii="Open Sans" w:eastAsia="Times New Roman" w:hAnsi="Open Sans" w:cs="Open Sans"/>
+          <w:color w:val="222222"/>
+          <w:kern w:val="0"/>
+          <w:sz w:val="23"/>
+          <w:szCs w:val="23"/>
+          <w14:ligatures w14:val="none"/>
+        </w:rPr>
+        <w:t xml:space="preserve">, the stored candidate is therefore the smallest post in that batch whose likes are strictly greater than the threshold. </w:t>
+      </w:r>
+      <w:proofErr w:type="spellStart"/>
+      <w:r>
+        <w:rPr>
+          <w:rFonts w:ascii="Open Sans" w:eastAsia="Times New Roman" w:hAnsi="Open Sans" w:cs="Open Sans"/>
+          <w:color w:val="222222"/>
+          <w:kern w:val="0"/>
+          <w:sz w:val="23"/>
+          <w:szCs w:val="23"/>
+          <w14:ligatures w14:val="none"/>
+        </w:rPr>
+        <w:t>PostAnalyser</w:t>
+      </w:r>
+      <w:proofErr w:type="spellEnd"/>
+      <w:r>
+        <w:rPr>
+          <w:rFonts w:ascii="Open Sans" w:eastAsia="Times New Roman" w:hAnsi="Open Sans" w:cs="Open Sans"/>
+          <w:color w:val="222222"/>
+          <w:kern w:val="0"/>
+          <w:sz w:val="23"/>
+          <w:szCs w:val="23"/>
+          <w14:ligatures w14:val="none"/>
+        </w:rPr>
+        <w:t xml:space="preserve"> performs this search for every batch and keeps the candidate with the smallest number of likes. Consequently, after all batches have been examined, result points to the globally least-liked post above the threshold. If no batch contains a valid post, result remains </w:t>
+      </w:r>
+      <w:proofErr w:type="spellStart"/>
+      <w:r>
+        <w:rPr>
+          <w:rFonts w:ascii="Open Sans" w:eastAsia="Times New Roman" w:hAnsi="Open Sans" w:cs="Open Sans"/>
+          <w:color w:val="222222"/>
+          <w:kern w:val="0"/>
+          <w:sz w:val="23"/>
+          <w:szCs w:val="23"/>
+          <w14:ligatures w14:val="none"/>
+        </w:rPr>
+        <w:t>nullptr</w:t>
+      </w:r>
+      <w:proofErr w:type="spellEnd"/>
+      <w:r>
+        <w:rPr>
+          <w:rFonts w:ascii="Open Sans" w:eastAsia="Times New Roman" w:hAnsi="Open Sans" w:cs="Open Sans"/>
+          <w:color w:val="222222"/>
+          <w:kern w:val="0"/>
+          <w:sz w:val="23"/>
+          <w:szCs w:val="23"/>
+          <w14:ligatures w14:val="none"/>
+        </w:rPr>
+        <w:t>.</w:t>
+      </w:r>
+    </w:p>
+    <w:p>
+      <w:pPr>
+        <w:shd w:val="clear" w:color="auto" w:fill="FFFFFF"/>
+        <w:spacing w:after="0" w:line="240" w:lineRule="auto"/>
+        <w:outlineLvl w:val="1"/>
+        <w:rPr>
+          <w:rFonts w:ascii="Open Sans" w:eastAsia="Times New Roman" w:hAnsi="Open Sans" w:cs="Open Sans"/>
+          <w:color w:val="222222"/>
+          <w:kern w:val="0"/>
+          <w:sz w:val="23"/>
+          <w:szCs w:val="23"/>
+          <w14:ligatures w14:val="none"/>
+        </w:rPr>
+      </w:pPr>
+    </w:p>
+    <w:p>
+      <w:pPr>
+        <w:shd w:val="clear" w:color="auto" w:fill="FFFFFF"/>
+        <w:spacing w:after="0" w:line="240" w:lineRule="auto"/>
+        <w:outlineLvl w:val="1"/>
+        <w:rPr>
+          <w:rFonts w:ascii="Open Sans" w:eastAsia="Times New Roman" w:hAnsi="Open Sans" w:cs="Open Sans"/>
+          <w:color w:val="222222"/>
+          <w:kern w:val="0"/>
+          <w:sz w:val="23"/>
+          <w:szCs w:val="23"/>
+          <w14:ligatures w14:val="none"/>
+        </w:rPr>
+      </w:pPr>
+      <w:r>
+        <w:rPr>
+          <w:rFonts w:ascii="Open Sans" w:eastAsia="Times New Roman" w:hAnsi="Open Sans" w:cs="Open Sans"/>
+          <w:color w:val="222222"/>
+          <w:kern w:val="0"/>
+          <w:sz w:val="23"/>
+          <w:szCs w:val="23"/>
+          <w14:ligatures w14:val="none"/>
+        </w:rPr>
+        <w:t xml:space="preserve">Each balanced BST search follows one root-to-leaf path of height </w:t>
+      </w:r>
+      <w:proofErr w:type="gramStart"/>
+      <w:r>
+        <w:rPr>
+          <w:rFonts w:ascii="Open Sans" w:eastAsia="Times New Roman" w:hAnsi="Open Sans" w:cs="Open Sans"/>
+          <w:color w:val="222222"/>
+          <w:kern w:val="0"/>
+          <w:sz w:val="23"/>
+          <w:szCs w:val="23"/>
+          <w14:ligatures w14:val="none"/>
+        </w:rPr>
+        <w:t>O(</w:t>
+      </w:r>
+      <w:proofErr w:type="gramEnd"/>
+      <w:r>
+        <w:rPr>
+          <w:rFonts w:ascii="Open Sans" w:eastAsia="Times New Roman" w:hAnsi="Open Sans" w:cs="Open Sans"/>
+          <w:color w:val="222222"/>
+          <w:kern w:val="0"/>
+          <w:sz w:val="23"/>
+          <w:szCs w:val="23"/>
+          <w14:ligatures w14:val="none"/>
+        </w:rPr>
+        <w:t>log n). Searching all b batches therefore takes O(b</w:t>
+      </w:r>
+      <w:r>
+        <w:rPr>
+          <w:rFonts w:ascii="Open Sans" w:eastAsia="Times New Roman" w:hAnsi="Open Sans" w:cs="Open Sans"/>
+          <w:color w:val="222222"/>
+          <w:kern w:val="0"/>
+          <w:sz w:val="23"/>
+          <w:szCs w:val="23"/>
+          <w14:ligatures w14:val="none"/>
+        </w:rPr>
+        <w:t xml:space="preserve"> </w:t>
+      </w:r>
+      <w:r>
+        <w:rPr>
+          <w:rFonts w:ascii="Open Sans" w:eastAsia="Times New Roman" w:hAnsi="Open Sans" w:cs="Open Sans"/>
+          <w:color w:val="222222"/>
+          <w:kern w:val="0"/>
+          <w:sz w:val="23"/>
+          <w:szCs w:val="23"/>
+          <w14:ligatures w14:val="none"/>
+        </w:rPr>
+        <w:t>log n).</w:t>
+      </w:r>
+    </w:p>
+    <w:p>
+      <w:pPr>
+        <w:shd w:val="clear" w:color="auto" w:fill="FFFFFF"/>
+        <w:spacing w:after="0" w:line="240" w:lineRule="auto"/>
+        <w:outlineLvl w:val="1"/>
+        <w:rPr>
+          <w:rFonts w:ascii="Open Sans" w:eastAsia="Times New Roman" w:hAnsi="Open Sans" w:cs="Open Sans"/>
+          <w:color w:val="222222"/>
+          <w:kern w:val="0"/>
           <w:sz w:val="32"/>
           <w:szCs w:val="32"/>
           <w14:ligatures w14:val="none"/>
@@ -500,10 +839,10 @@
         </w:rPr>
         <w:lastRenderedPageBreak/>
         <w:drawing>
-          <wp:inline distT="0" distB="0" distL="0" distR="0" wp14:anchorId="4673CD52" wp14:editId="1D5BCD01">
-            <wp:extent cx="4788535" cy="8863330"/>
+          <wp:inline distT="0" distB="0" distL="0" distR="0" wp14:anchorId="61F23748" wp14:editId="4F81AF06">
+            <wp:extent cx="4994275" cy="8863330"/>
             <wp:effectExtent l="0" t="0" r="0" b="1270"/>
-            <wp:docPr id="944023636" name="Picture 1"/>
+            <wp:docPr id="1735143233" name="Picture 1"/>
             <wp:cNvGraphicFramePr>
               <a:graphicFrameLocks xmlns:a="http://schemas.openxmlformats.org/drawingml/2006/main" noChangeAspect="1"/>
             </wp:cNvGraphicFramePr>
@@ -511,7 +850,7 @@
               <a:graphicData uri="http://schemas.openxmlformats.org/drawingml/2006/picture">
                 <pic:pic xmlns:pic="http://schemas.openxmlformats.org/drawingml/2006/picture">
                   <pic:nvPicPr>
-                    <pic:cNvPr id="944023636" name="Picture 944023636"/>
+                    <pic:cNvPr id="1735143233" name="Picture 1735143233"/>
                     <pic:cNvPicPr/>
                   </pic:nvPicPr>
                   <pic:blipFill>
@@ -529,7 +868,7 @@
                   <pic:spPr>
                     <a:xfrm>
                       <a:off x="0" y="0"/>
-                      <a:ext cx="4788535" cy="8863330"/>
+                      <a:ext cx="4994275" cy="8863330"/>
                     </a:xfrm>
                     <a:prstGeom prst="rect">
                       <a:avLst/>
@@ -541,16 +880,23 @@
           </wp:inline>
         </w:drawing>
       </w:r>
+    </w:p>
+    <w:p>
+      <w:pPr>
+        <w:rPr>
+          <w:rFonts w:hint="eastAsia"/>
+        </w:rPr>
+      </w:pPr>
       <w:r>
         <w:rPr>
           <w:noProof/>
         </w:rPr>
         <w:lastRenderedPageBreak/>
         <w:drawing>
-          <wp:inline distT="0" distB="0" distL="0" distR="0" wp14:anchorId="74117ED8" wp14:editId="4357D7AB">
-            <wp:extent cx="3657600" cy="3390900"/>
+          <wp:inline distT="0" distB="0" distL="0" distR="0" wp14:anchorId="08F60FFC" wp14:editId="5E5A2DF4">
+            <wp:extent cx="3683000" cy="7848600"/>
             <wp:effectExtent l="0" t="0" r="0" b="0"/>
-            <wp:docPr id="1607996735" name="Picture 2"/>
+            <wp:docPr id="2040621495" name="Picture 2"/>
             <wp:cNvGraphicFramePr>
               <a:graphicFrameLocks xmlns:a="http://schemas.openxmlformats.org/drawingml/2006/main" noChangeAspect="1"/>
             </wp:cNvGraphicFramePr>
@@ -558,7 +904,7 @@
               <a:graphicData uri="http://schemas.openxmlformats.org/drawingml/2006/picture">
                 <pic:pic xmlns:pic="http://schemas.openxmlformats.org/drawingml/2006/picture">
                   <pic:nvPicPr>
-                    <pic:cNvPr id="1607996735" name="Picture 1607996735"/>
+                    <pic:cNvPr id="2040621495" name="Picture 2040621495"/>
                     <pic:cNvPicPr/>
                   </pic:nvPicPr>
                   <pic:blipFill>
@@ -576,7 +922,54 @@
                   <pic:spPr>
                     <a:xfrm>
                       <a:off x="0" y="0"/>
-                      <a:ext cx="3657600" cy="3390900"/>
+                      <a:ext cx="3683000" cy="7848600"/>
+                    </a:xfrm>
+                    <a:prstGeom prst="rect">
+                      <a:avLst/>
+                    </a:prstGeom>
+                  </pic:spPr>
+                </pic:pic>
+              </a:graphicData>
+            </a:graphic>
+          </wp:inline>
+        </w:drawing>
+      </w:r>
+      <w:r>
+        <w:rPr>
+          <w:noProof/>
+        </w:rPr>
+        <w:lastRenderedPageBreak/>
+        <w:drawing>
+          <wp:inline distT="0" distB="0" distL="0" distR="0" wp14:anchorId="61D3D457" wp14:editId="2A8E2C45">
+            <wp:extent cx="4394200" cy="8699500"/>
+            <wp:effectExtent l="0" t="0" r="0" b="0"/>
+            <wp:docPr id="784641774" name="Picture 3"/>
+            <wp:cNvGraphicFramePr>
+              <a:graphicFrameLocks xmlns:a="http://schemas.openxmlformats.org/drawingml/2006/main" noChangeAspect="1"/>
+            </wp:cNvGraphicFramePr>
+            <a:graphic xmlns:a="http://schemas.openxmlformats.org/drawingml/2006/main">
+              <a:graphicData uri="http://schemas.openxmlformats.org/drawingml/2006/picture">
+                <pic:pic xmlns:pic="http://schemas.openxmlformats.org/drawingml/2006/picture">
+                  <pic:nvPicPr>
+                    <pic:cNvPr id="784641774" name="Picture 784641774"/>
+                    <pic:cNvPicPr/>
+                  </pic:nvPicPr>
+                  <pic:blipFill>
+                    <a:blip r:embed="rId6">
+                      <a:extLst>
+                        <a:ext uri="{28A0092B-C50C-407E-A947-70E740481C1C}">
+                          <a14:useLocalDpi xmlns:a14="http://schemas.microsoft.com/office/drawing/2010/main" val="0"/>
+                        </a:ext>
+                      </a:extLst>
+                    </a:blip>
+                    <a:stretch>
+                      <a:fillRect/>
+                    </a:stretch>
+                  </pic:blipFill>
+                  <pic:spPr>
+                    <a:xfrm>
+                      <a:off x="0" y="0"/>
+                      <a:ext cx="4394200" cy="8699500"/>
                     </a:xfrm>
                     <a:prstGeom prst="rect">
                       <a:avLst/>

</xml_diff>